<commit_message>
Fix Haver connection and tariff revenue pull for mismatched series lengths
- Use library(Haver) instead of requireNamespace() to ensure .onAttach
  initializes the DLL state haver.direct() needs (fixes segfault in batch mode)
- Pull FTRU@GOVFIN and TMMCN@USINT separately and full_join on date, so
  customs duties show even when imports value hasn't updated yet
- Refresh data: exchange rates through Mar 24, Feb customs duties now present

Co-Authored-By: Claude Opus 4.6 (1M context) <noreply@anthropic.com>
</commit_message>
<xml_diff>
--- a/output/publication/tariff_impacts_report.docx
+++ b/output/publication/tariff_impacts_report.docx
@@ -5308,7 +5308,7 @@
         <w:pStyle w:val="BodyText"/>
       </w:pPr>
       <w:r>
-        <w:t xml:space="preserve">The reality, however, has been different so far. As of February 2026, the US dollar is 7.4% weaker than its December 2024 average. There’s also been inconsistent depreciation among the targets of US tariffs. China’s yuan is 0.1% stronger than its December 2024 average, while Canada’s dollar is 0.9% stronger over the same period. Mexico’s peso is 14.0% stronger than December 2024, though this is not out of the range of pre-2025 variation, making it difficult to establish any causal claim.</w:t>
+        <w:t xml:space="preserve">The reality, however, has been different so far. As of February 2026, the US dollar is 7.6% weaker than its December 2024 average. There’s also been inconsistent depreciation among the targets of US tariffs. China’s yuan is 0.5% weaker than its December 2024 average, while Canada’s dollar is 0.7% stronger over the same period. Mexico’s peso is 13.4% stronger than December 2024, though this is not out of the range of pre-2025 variation, making it difficult to establish any causal claim.</w:t>
       </w:r>
     </w:p>
     <w:p>
@@ -9625,7 +9625,7 @@
           <w:i/>
           <w:iCs/>
         </w:rPr>
-        <w:t xml:space="preserve">Report generated on 2026-03-31 12:07:16.756732 using R R version 4.5.2 (2025-10-31 ucrt)</w:t>
+        <w:t xml:space="preserve">Report generated on 2026-03-31 13:08:13.54119 using R R version 4.5.2 (2025-10-31 ucrt)</w:t>
       </w:r>
     </w:p>
     <w:bookmarkEnd w:id="92"/>

</xml_diff>

<commit_message>
Publication run 2026-04-01: update daily ETR data from tariff rate tracker
Co-Authored-By: Claude Opus 4.6 (1M context) <noreply@anthropic.com>
</commit_message>
<xml_diff>
--- a/output/publication/tariff_impacts_report.docx
+++ b/output/publication/tariff_impacts_report.docx
@@ -210,7 +210,7 @@
         <w:t xml:space="preserve"> </w:t>
       </w:r>
       <w:r>
-        <w:t xml:space="preserve">follows the full schedule of statutory tariff rates as encoded in the Harmonized Tariff Schedule (HTS), weighted by 2024 import values. As of April 01, 2026, the import-weighted average effective tariff rate stood at 10.6% (see Figure A1 in the</w:t>
+        <w:t xml:space="preserve">follows the full schedule of statutory tariff rates as encoded in the Harmonized Tariff Schedule (HTS), weighted by 2024 import values. As of April 01, 2026, the import-weighted average effective tariff rate stood at 11.0% (see Figure A1 in the</w:t>
       </w:r>
       <w:r>
         <w:t xml:space="preserve"> </w:t>
@@ -9625,7 +9625,7 @@
           <w:i/>
           <w:iCs/>
         </w:rPr>
-        <w:t xml:space="preserve">Report generated on 2026-04-01 11:35:52.141788 using R R version 4.5.2 (2025-10-31 ucrt)</w:t>
+        <w:t xml:space="preserve">Report generated on 2026-04-01 14:19:01.496571 using R R version 4.5.2 (2025-10-31 ucrt)</w:t>
       </w:r>
     </w:p>
     <w:bookmarkEnd w:id="92"/>

</xml_diff>

<commit_message>
Publication run 2026-04-01: refresh outputs and daily ETR data
Co-Authored-By: Claude Opus 4.6 (1M context) <noreply@anthropic.com>
</commit_message>
<xml_diff>
--- a/output/publication/tariff_impacts_report.docx
+++ b/output/publication/tariff_impacts_report.docx
@@ -98,7 +98,7 @@
         <w:t xml:space="preserve"> </w:t>
       </w:r>
       <w:r>
-        <w:t xml:space="preserve">Imported PCE core goods and durable goods prices have risen 1.5% and 1.5% respectively during 2025 through January, both well above prior-year comparisons. Implied passthrough of tariffs to imported consumer goods prices ranges from roughly 46–86% for core goods and 51–115% for durables, depending on methodology (see Tables 1a–1b).</w:t>
+        <w:t xml:space="preserve">Imported PCE core goods and durable goods prices have both risen by 1.5% during 2025 through January, both well above prior-year comparisons. Implied passthrough of tariffs to imported consumer goods prices ranges from roughly 46–86% for core goods and 51–115% for durables, depending on methodology (see Tables 1a–1b).</w:t>
       </w:r>
     </w:p>
     <w:p>
@@ -210,7 +210,7 @@
         <w:t xml:space="preserve"> </w:t>
       </w:r>
       <w:r>
-        <w:t xml:space="preserve">follows the full schedule of statutory tariff rates as encoded in the Harmonized Tariff Schedule (HTS), weighted by 2024 import values. As of April 01, 2026, the import-weighted average effective tariff rate stood at 11.0% (see Figure A1 in the</w:t>
+        <w:t xml:space="preserve">follows the full schedule of statutory tariff rates as encoded in the Harmonized Tariff Schedule (HTS), weighted by 2024 import values. As of April 01, 2026, the import-weighted average effective tariff rate stood at 11.1% (see Figure A1 in the</w:t>
       </w:r>
       <w:r>
         <w:t xml:space="preserve"> </w:t>
@@ -4791,7 +4791,7 @@
         <w:pStyle w:val="FirstParagraph"/>
       </w:pPr>
       <w:r>
-        <w:t xml:space="preserve">As noted above, there are other groups beyond US consumers that might bear the burden of tariffs. For some of these groups (e.g. firms and their shareholders) it is difficult to observe these effects directly. However, we can observe import prices: if foreign producers are willing to accept lower prices on their exports, the incidence of tariffs could fall, at least in part, on them. Below, we plot non-petroleum import prices, and find no evidence of a reduction in prices as a response to tariffs. This is a noisy series, so a response is possible: potentially import prices would have continued on their 2024 trajectory. But there is no clear evidence of a reduction in these prices.</w:t>
+        <w:t xml:space="preserve">As noted above, there are other groups beyond US consumers that might bear the burden of tariffs. For some of these groups (e.g. firms and their shareholders) it is difficult to observe these effects directly. However, we can observe import prices: if foreign producers are willing to accept lower prices on their exports, the incidence of tariffs could fall, at least in part, on them. Below, we plot non-petroleum import prices, and find that in recent months prices have risen over their pre-2025 trend. This is a noisy series, so this effect should not be viewed as causal, but the evidence indicates that foreign producers are not willing to accept lower prices on imports, rather the opposite.</w:t>
       </w:r>
     </w:p>
     <w:p>
@@ -9625,7 +9625,7 @@
           <w:i/>
           <w:iCs/>
         </w:rPr>
-        <w:t xml:space="preserve">Report generated on 2026-04-01 14:19:01.496571 using R R version 4.5.2 (2025-10-31 ucrt)</w:t>
+        <w:t xml:space="preserve">Report generated on 2026-04-01 19:56:59.664385 using R R version 4.5.2 (2025-10-31 ucrt)</w:t>
       </w:r>
     </w:p>
     <w:bookmarkEnd w:id="92"/>

</xml_diff>